<commit_message>
Normalize textbook component terminology to units
</commit_message>
<xml_diff>
--- a/books/Speaking with PowerPoint/plan3.docx
+++ b/books/Speaking with PowerPoint/plan3.docx
@@ -237,7 +237,7 @@
           <w:szCs w:val="20"/>
           <w14:ligatures w14:val="none"/>
         </w:rPr>
-        <w:t>Use the Standard course as the master curriculum: 12 lessons, each producing one part of a cumulative business presentation portfolio.</w:t>
+        <w:t>Use the Standard course as the master curriculum: 12 units, each producing one part of a cumulative business presentation portfolio.</w:t>
       </w:r>
     </w:p>
     <w:tbl>
@@ -298,7 +298,7 @@
                 <w:szCs w:val="20"/>
                 <w14:ligatures w14:val="none"/>
               </w:rPr>
-              <w:t>L#</w:t>
+              <w:t>U#</w:t>
             </w:r>
           </w:p>
         </w:tc>
@@ -1930,7 +1930,7 @@
           <w:szCs w:val="20"/>
           <w14:ligatures w14:val="none"/>
         </w:rPr>
-        <w:t>Create all three books from the Standard 12-lesson spine.</w:t>
+        <w:t>Create all three books from the Standard 12-unit spine.</w:t>
       </w:r>
     </w:p>
     <w:p>
@@ -1955,7 +1955,7 @@
           <w:szCs w:val="20"/>
           <w14:ligatures w14:val="none"/>
         </w:rPr>
-        <w:t>Essentials: 8 lessons. Keep audience, message, structure, basic visuals, chart explanation, delivery, Q&amp;A, and final presentation. Remove or compress async delivery, advanced document roles, deeper data critique, and extended rehearsal cycles.</w:t>
+        <w:t>Essentials: 8 units. Keep audience, message, structure, basic visuals, chart explanation, delivery, Q&amp;A, and final presentation. Remove or compress async delivery, advanced document roles, deeper data critique, and extended rehearsal cycles.</w:t>
       </w:r>
     </w:p>
     <w:p>
@@ -1980,7 +1980,7 @@
           <w:szCs w:val="20"/>
           <w14:ligatures w14:val="none"/>
         </w:rPr>
-        <w:t>Standard: 12 lessons. This is the canonical course and source of truth for objectives, rubrics, examples, and teacher notes.</w:t>
+        <w:t>Standard: 12 units. This is the canonical course and source of truth for objectives, rubrics, examples, and teacher notes.</w:t>
       </w:r>
     </w:p>
     <w:p>
@@ -2005,7 +2005,7 @@
           <w:szCs w:val="20"/>
           <w14:ligatures w14:val="none"/>
         </w:rPr>
-        <w:t>Long: 15 lessons. Add extended units for advanced data storytelling, executive summaries and decision decks, facilitation and stakeholder management, recorded/async presentations, and a second assessed presentation cycle.</w:t>
+        <w:t>Long: 15 units. Add extended units for advanced data storytelling, executive summaries and decision decks, facilitation and stakeholder management, recorded/async presentations, and a second assessed presentation cycle.</w:t>
       </w:r>
     </w:p>
     <w:p>
@@ -2142,7 +2142,7 @@
           <w:szCs w:val="20"/>
           <w14:ligatures w14:val="none"/>
         </w:rPr>
-        <w:t>Each model presentation must be mapped to specific lessons, language points, visual-design points, delivery behaviors, and assessment criteria. Do not include a generic list of presentation tools in the learner-facing summary; tools appear only where a task requires a practical choice.</w:t>
+        <w:t>Each model presentation must be mapped to specific units, language points, visual-design points, delivery behaviors, and assessment criteria. Do not include a generic list of presentation tools in the learner-facing summary; tools appear only where a task requires a practical choice.</w:t>
       </w:r>
     </w:p>
     <w:p>
@@ -2222,7 +2222,7 @@
           <w:szCs w:val="20"/>
           <w14:ligatures w14:val="none"/>
         </w:rPr>
-        <w:t>Content Architect: Owns the lesson map, tier mapping, traceability matrix, assessment model, and approval gates.</w:t>
+        <w:t>Content Architect: Owns the unit map, tier mapping, traceability matrix, assessment model, and approval gates.</w:t>
       </w:r>
     </w:p>
     <w:p>
@@ -2381,7 +2381,7 @@
           <w:szCs w:val="20"/>
           <w14:ligatures w14:val="none"/>
         </w:rPr>
-        <w:t>Build a traceability matrix from the consolidated revision task list to lessons, deliverables, QA checks, and deferred items.</w:t>
+        <w:t>Build a traceability matrix from the consolidated revision task list to units, deliverables, QA checks, and deferred items.</w:t>
       </w:r>
     </w:p>
     <w:p>
@@ -2410,7 +2410,7 @@
           <w:szCs w:val="20"/>
           <w14:ligatures w14:val="none"/>
         </w:rPr>
-        <w:t>Approve the Standard 12-lesson spine before rewriting units.</w:t>
+        <w:t>Approve the Standard 12-unit spine before rewriting units.</w:t>
       </w:r>
     </w:p>
     <w:p>
@@ -2468,7 +2468,7 @@
           <w:szCs w:val="20"/>
           <w14:ligatures w14:val="none"/>
         </w:rPr>
-        <w:t>Create or replace assets only after lesson content is stable.</w:t>
+        <w:t>Create or replace assets only after unit content is stable.</w:t>
       </w:r>
     </w:p>
     <w:p>
@@ -2859,7 +2859,7 @@
           <w:szCs w:val="20"/>
           <w14:ligatures w14:val="none"/>
         </w:rPr>
-        <w:t>External review gate: After Plan 3 implementation, if Claude.ai or ChatGPT identifies a significant issue that affects scope, pedagogy, factual accuracy, accessibility, or assessment validity, pause production, classify the issue, update the traceability matrix, and revise the affected lesson or plan section before continuing.</w:t>
+        <w:t>External review gate: After Plan 3 implementation, if Claude.ai or ChatGPT identifies a significant issue that affects scope, pedagogy, factual accuracy, accessibility, or assessment validity, pause production, classify the issue, update the traceability matrix, and revise the affected unit or plan section before continuing.</w:t>
       </w:r>
     </w:p>
     <w:p>
@@ -2994,6 +2994,11 @@
     </w:p>
     <w:sectPr>
       <w:footerReference w:type="default" r:id="rId7"/>
+      <w:headerReference w:type="default" r:id="rId10"/>
+      <w:headerReference w:type="first" r:id="rId11"/>
+      <w:footerReference w:type="first" r:id="rId12"/>
+      <w:headerReference w:type="even" r:id="rId13"/>
+      <w:footerReference w:type="even" r:id="rId14"/>
       <w:pgSz w:w="11906" w:h="16838" w:code="9"/>
       <w:pgMar w:top="1985" w:right="1701" w:bottom="1701" w:left="1701" w:header="567" w:footer="454" w:gutter="0"/>
       <w:cols w:space="708"/>
@@ -3076,6 +3081,26 @@
 </w:ftr>
 </file>
 
+<file path=word/footer2.xml><?xml version="1.0" encoding="utf-8"?>
+<w:ftr xmlns:m="http://schemas.openxmlformats.org/officeDocument/2006/math" xmlns:mc="http://schemas.openxmlformats.org/markup-compatibility/2006" xmlns:mo="http://schemas.microsoft.com/office/mac/office/2008/main" xmlns:mv="urn:schemas-microsoft-com:mac:vml" xmlns:o="urn:schemas-microsoft-com:office:office" xmlns:r="http://schemas.openxmlformats.org/officeDocument/2006/relationships" xmlns:v="urn:schemas-microsoft-com:vml" xmlns:w10="urn:schemas-microsoft-com:office:word" xmlns:w14="http://schemas.microsoft.com/office/word/2010/wordml" xmlns:w="http://schemas.openxmlformats.org/wordprocessingml/2006/main" xmlns:wne="http://schemas.microsoft.com/office/word/2006/wordml" xmlns:wp14="http://schemas.microsoft.com/office/word/2010/wordprocessingDrawing" xmlns:wp="http://schemas.openxmlformats.org/drawingml/2006/wordprocessingDrawing" xmlns:wpc="http://schemas.microsoft.com/office/word/2010/wordprocessingCanvas" xmlns:wpg="http://schemas.microsoft.com/office/word/2010/wordprocessingGroup" xmlns:wpi="http://schemas.microsoft.com/office/word/2010/wordprocessingInk" xmlns:wps="http://schemas.microsoft.com/office/word/2010/wordprocessingShape" mc:Ignorable="w14 wp14">
+  <w:p>
+    <w:pPr>
+      <w:pStyle w:val="Footer"/>
+    </w:pPr>
+  </w:p>
+</w:ftr>
+</file>
+
+<file path=word/footer3.xml><?xml version="1.0" encoding="utf-8"?>
+<w:ftr xmlns:m="http://schemas.openxmlformats.org/officeDocument/2006/math" xmlns:mc="http://schemas.openxmlformats.org/markup-compatibility/2006" xmlns:mo="http://schemas.microsoft.com/office/mac/office/2008/main" xmlns:mv="urn:schemas-microsoft-com:mac:vml" xmlns:o="urn:schemas-microsoft-com:office:office" xmlns:r="http://schemas.openxmlformats.org/officeDocument/2006/relationships" xmlns:v="urn:schemas-microsoft-com:vml" xmlns:w10="urn:schemas-microsoft-com:office:word" xmlns:w14="http://schemas.microsoft.com/office/word/2010/wordml" xmlns:w="http://schemas.openxmlformats.org/wordprocessingml/2006/main" xmlns:wne="http://schemas.microsoft.com/office/word/2006/wordml" xmlns:wp14="http://schemas.microsoft.com/office/word/2010/wordprocessingDrawing" xmlns:wp="http://schemas.openxmlformats.org/drawingml/2006/wordprocessingDrawing" xmlns:wpc="http://schemas.microsoft.com/office/word/2010/wordprocessingCanvas" xmlns:wpg="http://schemas.microsoft.com/office/word/2010/wordprocessingGroup" xmlns:wpi="http://schemas.microsoft.com/office/word/2010/wordprocessingInk" xmlns:wps="http://schemas.microsoft.com/office/word/2010/wordprocessingShape" mc:Ignorable="w14 wp14">
+  <w:p>
+    <w:pPr>
+      <w:pStyle w:val="Footer"/>
+    </w:pPr>
+  </w:p>
+</w:ftr>
+</file>
+
 <file path=word/footnotes.xml><?xml version="1.0" encoding="utf-8"?>
 <w:footnotes xmlns:wpc="http://schemas.microsoft.com/office/word/2010/wordprocessingCanvas" xmlns:cx="http://schemas.microsoft.com/office/drawing/2014/chartex" xmlns:cx1="http://schemas.microsoft.com/office/drawing/2015/9/8/chartex" xmlns:cx2="http://schemas.microsoft.com/office/drawing/2015/10/21/chartex" xmlns:cx3="http://schemas.microsoft.com/office/drawing/2016/5/9/chartex" xmlns:cx4="http://schemas.microsoft.com/office/drawing/2016/5/10/chartex" xmlns:cx5="http://schemas.microsoft.com/office/drawing/2016/5/11/chartex" xmlns:cx6="http://schemas.microsoft.com/office/drawing/2016/5/12/chartex" xmlns:cx7="http://schemas.microsoft.com/office/drawing/2016/5/13/chartex" xmlns:cx8="http://schemas.microsoft.com/office/drawing/2016/5/14/chartex" xmlns:mc="http://schemas.openxmlformats.org/markup-compatibility/2006" xmlns:aink="http://schemas.microsoft.com/office/drawing/2016/ink" xmlns:am3d="http://schemas.microsoft.com/office/drawing/2017/model3d" xmlns:o="urn:schemas-microsoft-com:office:office" xmlns:oel="http://schemas.microsoft.com/office/2019/extlst" xmlns:r="http://schemas.openxmlformats.org/officeDocument/2006/relationships" xmlns:m="http://schemas.openxmlformats.org/officeDocument/2006/math" xmlns:v="urn:schemas-microsoft-com:vml" xmlns:wp14="http://schemas.microsoft.com/office/word/2010/wordprocessingDrawing" xmlns:wp="http://schemas.openxmlformats.org/drawingml/2006/wordprocessingDrawing" xmlns:w10="urn:schemas-microsoft-com:office:word" xmlns:w="http://schemas.openxmlformats.org/wordprocessingml/2006/main" xmlns:w14="http://schemas.microsoft.com/office/word/2010/wordml" xmlns:w15="http://schemas.microsoft.com/office/word/2012/wordml" xmlns:w16cei="http://schemas.microsoft.com/office/word/2026/wordml/cei" xmlns:w16cex="http://schemas.microsoft.com/office/word/2018/wordml/cex" xmlns:w16cid="http://schemas.microsoft.com/office/word/2016/wordml/cid" xmlns:w16="http://schemas.microsoft.com/office/word/2018/wordml" xmlns:w16du="http://schemas.microsoft.com/office/word/2023/wordml/word16du" xmlns:w16sdtdh="http://schemas.microsoft.com/office/word/2020/wordml/sdtdatahash" xmlns:w16sdtfl="http://schemas.microsoft.com/office/word/2024/wordml/sdtformatlock" xmlns:w16se="http://schemas.microsoft.com/office/word/2015/wordml/symex" xmlns:wpg="http://schemas.microsoft.com/office/word/2010/wordprocessingGroup" xmlns:wpi="http://schemas.microsoft.com/office/word/2010/wordprocessingInk" xmlns:wne="http://schemas.microsoft.com/office/word/2006/wordml" xmlns:wps="http://schemas.microsoft.com/office/word/2010/wordprocessingShape" mc:Ignorable="w14 w15 w16se w16cid w16 w16cex w16sdtdh w16sdtfl w16du wp14">
   <w:footnote w:type="separator" w:id="-1">
@@ -3099,6 +3124,36 @@
     </w:p>
   </w:footnote>
 </w:footnotes>
+</file>
+
+<file path=word/header1.xml><?xml version="1.0" encoding="utf-8"?>
+<w:hdr xmlns:m="http://schemas.openxmlformats.org/officeDocument/2006/math" xmlns:mc="http://schemas.openxmlformats.org/markup-compatibility/2006" xmlns:mo="http://schemas.microsoft.com/office/mac/office/2008/main" xmlns:mv="urn:schemas-microsoft-com:mac:vml" xmlns:o="urn:schemas-microsoft-com:office:office" xmlns:r="http://schemas.openxmlformats.org/officeDocument/2006/relationships" xmlns:v="urn:schemas-microsoft-com:vml" xmlns:w10="urn:schemas-microsoft-com:office:word" xmlns:w14="http://schemas.microsoft.com/office/word/2010/wordml" xmlns:w="http://schemas.openxmlformats.org/wordprocessingml/2006/main" xmlns:wne="http://schemas.microsoft.com/office/word/2006/wordml" xmlns:wp14="http://schemas.microsoft.com/office/word/2010/wordprocessingDrawing" xmlns:wp="http://schemas.openxmlformats.org/drawingml/2006/wordprocessingDrawing" xmlns:wpc="http://schemas.microsoft.com/office/word/2010/wordprocessingCanvas" xmlns:wpg="http://schemas.microsoft.com/office/word/2010/wordprocessingGroup" xmlns:wpi="http://schemas.microsoft.com/office/word/2010/wordprocessingInk" xmlns:wps="http://schemas.microsoft.com/office/word/2010/wordprocessingShape" mc:Ignorable="w14 wp14">
+  <w:p>
+    <w:pPr>
+      <w:pStyle w:val="Header"/>
+    </w:pPr>
+  </w:p>
+</w:hdr>
+</file>
+
+<file path=word/header2.xml><?xml version="1.0" encoding="utf-8"?>
+<w:hdr xmlns:m="http://schemas.openxmlformats.org/officeDocument/2006/math" xmlns:mc="http://schemas.openxmlformats.org/markup-compatibility/2006" xmlns:mo="http://schemas.microsoft.com/office/mac/office/2008/main" xmlns:mv="urn:schemas-microsoft-com:mac:vml" xmlns:o="urn:schemas-microsoft-com:office:office" xmlns:r="http://schemas.openxmlformats.org/officeDocument/2006/relationships" xmlns:v="urn:schemas-microsoft-com:vml" xmlns:w10="urn:schemas-microsoft-com:office:word" xmlns:w14="http://schemas.microsoft.com/office/word/2010/wordml" xmlns:w="http://schemas.openxmlformats.org/wordprocessingml/2006/main" xmlns:wne="http://schemas.microsoft.com/office/word/2006/wordml" xmlns:wp14="http://schemas.microsoft.com/office/word/2010/wordprocessingDrawing" xmlns:wp="http://schemas.openxmlformats.org/drawingml/2006/wordprocessingDrawing" xmlns:wpc="http://schemas.microsoft.com/office/word/2010/wordprocessingCanvas" xmlns:wpg="http://schemas.microsoft.com/office/word/2010/wordprocessingGroup" xmlns:wpi="http://schemas.microsoft.com/office/word/2010/wordprocessingInk" xmlns:wps="http://schemas.microsoft.com/office/word/2010/wordprocessingShape" mc:Ignorable="w14 wp14">
+  <w:p>
+    <w:pPr>
+      <w:pStyle w:val="Header"/>
+    </w:pPr>
+  </w:p>
+</w:hdr>
+</file>
+
+<file path=word/header3.xml><?xml version="1.0" encoding="utf-8"?>
+<w:hdr xmlns:m="http://schemas.openxmlformats.org/officeDocument/2006/math" xmlns:mc="http://schemas.openxmlformats.org/markup-compatibility/2006" xmlns:mo="http://schemas.microsoft.com/office/mac/office/2008/main" xmlns:mv="urn:schemas-microsoft-com:mac:vml" xmlns:o="urn:schemas-microsoft-com:office:office" xmlns:r="http://schemas.openxmlformats.org/officeDocument/2006/relationships" xmlns:v="urn:schemas-microsoft-com:vml" xmlns:w10="urn:schemas-microsoft-com:office:word" xmlns:w14="http://schemas.microsoft.com/office/word/2010/wordml" xmlns:w="http://schemas.openxmlformats.org/wordprocessingml/2006/main" xmlns:wne="http://schemas.microsoft.com/office/word/2006/wordml" xmlns:wp14="http://schemas.microsoft.com/office/word/2010/wordprocessingDrawing" xmlns:wp="http://schemas.openxmlformats.org/drawingml/2006/wordprocessingDrawing" xmlns:wpc="http://schemas.microsoft.com/office/word/2010/wordprocessingCanvas" xmlns:wpg="http://schemas.microsoft.com/office/word/2010/wordprocessingGroup" xmlns:wpi="http://schemas.microsoft.com/office/word/2010/wordprocessingInk" xmlns:wps="http://schemas.microsoft.com/office/word/2010/wordprocessingShape" mc:Ignorable="w14 wp14">
+  <w:p>
+    <w:pPr>
+      <w:pStyle w:val="Header"/>
+    </w:pPr>
+  </w:p>
+</w:hdr>
 </file>
 
 <file path=word/numbering.xml><?xml version="1.0" encoding="utf-8"?>

</xml_diff>